<commit_message>
updated the logo in title
</commit_message>
<xml_diff>
--- a/src/assets/articles/COMPARATIVE STUDY OF HUMAN AND MACHINE TRANSLATIONS.docx
+++ b/src/assets/articles/COMPARATIVE STUDY OF HUMAN AND MACHINE TRANSLATIONS.docx
@@ -98,7 +98,6 @@
         <w:spacing w:after="160" w:line="259" w:lineRule="auto"/>
         <w:jc w:val="center"/>
       </w:pPr>
-      <w:bookmarkStart w:id="0" w:name="_GoBack"/>
       <w:r>
         <w:rPr>
           <w:b/>
@@ -121,7 +120,6 @@
         </w:rPr>
         <w:t>CHANGGAN BALLADS</w:t>
       </w:r>
-      <w:bookmarkEnd w:id="0"/>
     </w:p>
     <w:p>
       <w:pPr>
@@ -314,6 +312,34 @@
       <w:pPr>
         <w:spacing w:before="110" w:after="110" w:line="259" w:lineRule="auto"/>
         <w:rPr>
+          <w:i/>
+          <w:sz w:val="22"/>
+          <w:szCs w:val="22"/>
+        </w:rPr>
+      </w:pPr>
+    </w:p>
+    <w:p>
+      <w:pPr>
+        <w:spacing w:before="110" w:after="110" w:line="259" w:lineRule="auto"/>
+        <w:rPr>
+          <w:i/>
+          <w:sz w:val="22"/>
+          <w:szCs w:val="22"/>
+        </w:rPr>
+      </w:pPr>
+      <w:r>
+        <w:rPr>
+          <w:i/>
+          <w:sz w:val="22"/>
+          <w:szCs w:val="22"/>
+        </w:rPr>
+        <w:t>Published: July 2026</w:t>
+      </w:r>
+    </w:p>
+    <w:p>
+      <w:pPr>
+        <w:spacing w:before="110" w:after="110" w:line="259" w:lineRule="auto"/>
+        <w:rPr>
           <w:sz w:val="22"/>
           <w:szCs w:val="22"/>
         </w:rPr>
@@ -426,87 +452,107 @@
           <w:sz w:val="22"/>
           <w:szCs w:val="22"/>
         </w:rPr>
-        <w:t xml:space="preserve"> 3D model as a theoretical framework, this research examines the translations from semantic, pragmatic, and syntactic perspectives. The study aims to investigate the differences and similarities between human and machine translation in conveying the meaning of the poem. The </w:t>
-      </w:r>
-      <w:proofErr w:type="spellStart"/>
+        <w:t xml:space="preserve"> 3D model as a theoretical framework, this research examines the translations from semantic, pragmatic, and syntactic perspectives. The study aims to investigate the differences and similarities between human and machine translation in conveying the meaning of the poem. The analysis</w:t>
+      </w:r>
       <w:r>
         <w:rPr>
           <w:sz w:val="22"/>
           <w:szCs w:val="22"/>
         </w:rPr>
-        <w:t>analysisreveals</w:t>
-      </w:r>
-      <w:proofErr w:type="spellEnd"/>
+        <w:t xml:space="preserve"> </w:t>
+      </w:r>
       <w:r>
         <w:rPr>
           <w:sz w:val="22"/>
           <w:szCs w:val="22"/>
         </w:rPr>
-        <w:t xml:space="preserve"> </w:t>
-      </w:r>
-      <w:proofErr w:type="spellStart"/>
+        <w:t>reveals the</w:t>
+      </w:r>
       <w:r>
         <w:rPr>
           <w:sz w:val="22"/>
           <w:szCs w:val="22"/>
         </w:rPr>
-        <w:t>thestrength</w:t>
-      </w:r>
-      <w:proofErr w:type="spellEnd"/>
+        <w:t xml:space="preserve"> </w:t>
+      </w:r>
+      <w:bookmarkStart w:id="0" w:name="_GoBack"/>
+      <w:bookmarkEnd w:id="0"/>
       <w:r>
         <w:rPr>
           <w:sz w:val="22"/>
           <w:szCs w:val="22"/>
         </w:rPr>
-        <w:t xml:space="preserve"> </w:t>
-      </w:r>
-      <w:proofErr w:type="spellStart"/>
+        <w:t>strength and</w:t>
+      </w:r>
       <w:r>
         <w:rPr>
           <w:sz w:val="22"/>
           <w:szCs w:val="22"/>
         </w:rPr>
-        <w:t>andlimitationsofboth</w:t>
-      </w:r>
-      <w:proofErr w:type="spellEnd"/>
+        <w:t xml:space="preserve"> </w:t>
+      </w:r>
       <w:r>
         <w:rPr>
           <w:sz w:val="22"/>
           <w:szCs w:val="22"/>
         </w:rPr>
-        <w:t xml:space="preserve"> </w:t>
-      </w:r>
-      <w:proofErr w:type="spellStart"/>
+        <w:t>limitations</w:t>
+      </w:r>
       <w:r>
         <w:rPr>
           <w:sz w:val="22"/>
           <w:szCs w:val="22"/>
         </w:rPr>
-        <w:t>humanand</w:t>
-      </w:r>
-      <w:proofErr w:type="spellEnd"/>
+        <w:t xml:space="preserve"> </w:t>
+      </w:r>
       <w:r>
         <w:rPr>
           <w:sz w:val="22"/>
           <w:szCs w:val="22"/>
         </w:rPr>
-        <w:t xml:space="preserve"> </w:t>
-      </w:r>
-      <w:proofErr w:type="spellStart"/>
+        <w:t>of</w:t>
+      </w:r>
       <w:r>
         <w:rPr>
           <w:sz w:val="22"/>
           <w:szCs w:val="22"/>
         </w:rPr>
-        <w:t>machinetranslation</w:t>
-      </w:r>
-      <w:proofErr w:type="spellEnd"/>
+        <w:t xml:space="preserve"> </w:t>
+      </w:r>
       <w:r>
         <w:rPr>
           <w:sz w:val="22"/>
           <w:szCs w:val="22"/>
         </w:rPr>
-        <w:t>. The findings of this study contribute to a better understanding of the complexities of translation and the potential of machine translation in conveying the essence of classical poetry.</w:t>
+        <w:t>both human</w:t>
+      </w:r>
+      <w:r>
+        <w:rPr>
+          <w:sz w:val="22"/>
+          <w:szCs w:val="22"/>
+        </w:rPr>
+        <w:t xml:space="preserve"> </w:t>
+      </w:r>
+      <w:r>
+        <w:rPr>
+          <w:sz w:val="22"/>
+          <w:szCs w:val="22"/>
+        </w:rPr>
+        <w:t>and machine</w:t>
+      </w:r>
+      <w:r>
+        <w:rPr>
+          <w:sz w:val="22"/>
+          <w:szCs w:val="22"/>
+        </w:rPr>
+        <w:t xml:space="preserve"> </w:t>
+      </w:r>
+      <w:r>
+        <w:rPr>
+          <w:sz w:val="22"/>
+          <w:szCs w:val="22"/>
+        </w:rPr>
+        <w:t>translation. The findings of this study contribute to a better understanding of the complexities of translation and the potential of machine translation in conveying the essence of classical poetry.</w:t>
       </w:r>
     </w:p>
     <w:p>
@@ -619,16 +665,19 @@
         <w:jc w:val="both"/>
       </w:pPr>
       <w:r>
-        <w:t>Over the last few decades, translation studies have seen tremendous progress, especially since Artificial Intelligence (AI) and its sub-branch, Neural Machine Translation (NMT), emerged on the scene. Modern machine translation systems can produce accurate translations, which raises discussion about whether they can meet the standard of human translation. AI advancements have greatly enhanced the efficiency of translation, yet translating literary works remains problematic due to the need for cultural knowledge, emotions, symbolism, and functional approaches to style.</w:t>
-      </w:r>
-    </w:p>
-    <w:p>
-      <w:pPr>
-        <w:spacing w:after="160" w:line="259" w:lineRule="auto"/>
-        <w:jc w:val="both"/>
-      </w:pPr>
+        <w:t xml:space="preserve">Over the last few decades, translation studies have seen tremendous progress, especially since Artificial Intelligence (AI) and its sub-branch, Neural Machine Translation (NMT), emerged on the scene. Modern machine translation systems can produce accurate translations, which raises discussion about whether they can meet the standard of human translation. AI advancements have </w:t>
+      </w:r>
       <w:r>
         <w:lastRenderedPageBreak/>
+        <w:t>greatly enhanced the efficiency of translation, yet translating literary works remains problematic due to the need for cultural knowledge, emotions, symbolism, and functional approaches to style.</w:t>
+      </w:r>
+    </w:p>
+    <w:p>
+      <w:pPr>
+        <w:spacing w:after="160" w:line="259" w:lineRule="auto"/>
+        <w:jc w:val="both"/>
+      </w:pPr>
+      <w:r>
         <w:t xml:space="preserve">The term translation is usually interpreted as transferring meaning from one language (source language) to another language (target language). According to Ghazala (1995), translation means transferring meaning from one language to another, and </w:t>
       </w:r>
       <w:proofErr w:type="spellStart"/>
@@ -761,6 +810,7 @@
         <w:jc w:val="both"/>
       </w:pPr>
       <w:r>
+        <w:lastRenderedPageBreak/>
         <w:t xml:space="preserve">To this end, the present study aims to examine the difference between Meta AI's translation and the human version of </w:t>
       </w:r>
       <w:proofErr w:type="spellStart"/>
@@ -778,11 +828,7 @@
         <w:t xml:space="preserve"> Ballads</w:t>
       </w:r>
       <w:r>
-        <w:t xml:space="preserve"> translated by Ezra Pound. It examines whether machine </w:t>
-      </w:r>
-      <w:r>
-        <w:lastRenderedPageBreak/>
-        <w:t>translation can meet the requirements of translating the semantic, syntactic, and pragmatic layers of classical Chinese poems. The research also looks at the extent to which emotional depth, cultural values, and poetic features are retained when using human translation.</w:t>
+        <w:t xml:space="preserve"> translated by Ezra Pound. It examines whether machine translation can meet the requirements of translating the semantic, syntactic, and pragmatic layers of classical Chinese poems. The research also looks at the extent to which emotional depth, cultural values, and poetic features are retained when using human translation.</w:t>
       </w:r>
     </w:p>
     <w:p>
@@ -929,11 +975,8 @@
         <w:jc w:val="both"/>
       </w:pPr>
       <w:r>
-        <w:t xml:space="preserve">Coherence, cohesion, register, and pragmatics also play a role in modern translation. Coherence is achieved by making grammatical and lexical links that enable the unity of text, and cohesion by </w:t>
-      </w:r>
-      <w:r>
         <w:lastRenderedPageBreak/>
-        <w:t>making logical relationships between ideas. Register is the way translators ensure a suitable tone in the communicative context. Their neglect will consequently lead to semantic and pragmatic loss and therefore reduced accuracy and effectiveness of the translated text.</w:t>
+        <w:t>Coherence, cohesion, register, and pragmatics also play a role in modern translation. Coherence is achieved by making grammatical and lexical links that enable the unity of text, and cohesion by making logical relationships between ideas. Register is the way translators ensure a suitable tone in the communicative context. Their neglect will consequently lead to semantic and pragmatic loss and therefore reduced accuracy and effectiveness of the translated text.</w:t>
       </w:r>
     </w:p>
     <w:p>
@@ -1050,7 +1093,11 @@
         <w:jc w:val="both"/>
       </w:pPr>
       <w:r>
-        <w:t>The increasing impact of technology has also affected the perception of translation. Traditional methods mainly considered translation as the product and focused on the equivalence of language. It is now seen that translation involves an active process of interpretation, cultural negotiation, and choices and decisions. While AI is now an invaluable tool in multilingual communication, human translators still have a key role to play in ensuring accurate and culturally appropriate literary works.</w:t>
+        <w:t xml:space="preserve">The increasing impact of technology has also affected the perception of translation. Traditional methods mainly considered translation as the product and focused on the equivalence of language. It is now seen that translation involves an active process of interpretation, cultural negotiation, and choices and decisions. While AI is now an invaluable tool in multilingual communication, human </w:t>
+      </w:r>
+      <w:r>
+        <w:lastRenderedPageBreak/>
+        <w:t>translators still have a key role to play in ensuring accurate and culturally appropriate literary works.</w:t>
       </w:r>
     </w:p>
     <w:p>
@@ -1063,7 +1110,6 @@
           <w:b/>
           <w:bCs/>
         </w:rPr>
-        <w:lastRenderedPageBreak/>
         <w:t>2.3 The Problem of Reliability of Human and Machine Translations</w:t>
       </w:r>
     </w:p>
@@ -1218,11 +1264,11 @@
       </w:r>
       <w:proofErr w:type="spellEnd"/>
       <w:r>
-        <w:t xml:space="preserve"> Three-Dimensional Model. Each part of the study does not look at the original Chinese text, but aims to examine the result of transliteration of each English translation, which shows the linguistic and literary features of the poem. The results are likely to impact the field of translation by offering a better sense of what AI can do for </w:t>
+        <w:t xml:space="preserve"> Three-Dimensional Model. Each part of </w:t>
       </w:r>
       <w:r>
         <w:lastRenderedPageBreak/>
-        <w:t>literary translation and revealing the ongoing necessity of human intervention in the domain to maintain the nuances of meaning, cultural symbolism, and artistic expression in poetry.</w:t>
+        <w:t>the study does not look at the original Chinese text, but aims to examine the result of transliteration of each English translation, which shows the linguistic and literary features of the poem. The results are likely to impact the field of translation by offering a better sense of what AI can do for literary translation and revealing the ongoing necessity of human intervention in the domain to maintain the nuances of meaning, cultural symbolism, and artistic expression in poetry.</w:t>
       </w:r>
     </w:p>
     <w:p>
@@ -1453,11 +1499,11 @@
       </w:r>
       <w:proofErr w:type="spellEnd"/>
       <w:r>
-        <w:t xml:space="preserve"> Three-Dimensional Model was taken as a guide to the analysis that focused on the first two dimensions of the model. These dimensions were used to interrogate the semantic, syntactic, and pragmatic aspects of the </w:t>
+        <w:t xml:space="preserve"> Three-Dimensional Model was </w:t>
       </w:r>
       <w:r>
         <w:lastRenderedPageBreak/>
-        <w:t>translations and the similarities and differences in translation strategies between the two translations.</w:t>
+        <w:t>taken as a guide to the analysis that focused on the first two dimensions of the model. These dimensions were used to interrogate the semantic, syntactic, and pragmatic aspects of the translations and the similarities and differences in translation strategies between the two translations.</w:t>
       </w:r>
     </w:p>
     <w:p>
@@ -2137,6 +2183,7 @@
                 <w:color w:val="000000"/>
                 <w:spacing w:val="-4"/>
               </w:rPr>
+              <w:lastRenderedPageBreak/>
               <w:t>Word</w:t>
             </w:r>
             <w:r>
@@ -2255,7 +2302,6 @@
                 <w:bCs/>
                 <w:color w:val="000000"/>
               </w:rPr>
-              <w:lastRenderedPageBreak/>
               <w:t xml:space="preserve">Use of </w:t>
             </w:r>
             <w:r>

</xml_diff>